<commit_message>
docs: rename locker_issue->short_service_time and damaged_on_arrival->delivery_failed
- All Word docs in deliverables/ updated with surgical replacement
- All notebooks in notebooks/ updated (62 total changes across 8 notebooks)
- Format, structure, analysis unchanged — only variable names corrected
- Reflects instructor feedback on leakage fix and semantic precision
</commit_message>
<xml_diff>
--- a/deliverables/01_project_description.docx
+++ b/deliverables/01_project_description.docx
@@ -255,118 +255,118 @@
           <w:sz w:val="18"/>
         </w:rPr>
         <w:t>Column                 Type     Description                                        Role</w:t>
+        <w:br/>
+        <w:t>──────────────────────────────────────────────────────────────────────────────────────────</w:t>
+        <w:br/>
+        <w:t>package_id             string   Unique identifier (PKG-ES-XXXXXXX)                 ID only</w:t>
+        <w:br/>
+        <w:t>package_type           categ.   standard / high_value / fragile / locker / large   Feature</w:t>
+        <w:br/>
+        <w:t>shift                  categ.   morning / afternoon / night                        Feature</w:t>
+        <w:br/>
+        <w:t>carrier                categ.   carrier_A=Amazon, B=SEUR, C=DHL, D=Regional Carrier         Feature</w:t>
+        <w:br/>
+        <w:t>route_distance_km      float64  Route distance (2–85 km)                           Feature</w:t>
+        <w:br/>
+        <w:t>packages_in_route      int64    Total packages in driver route (15–120)            Feature</w:t>
+        <w:br/>
+        <w:t>double_scan            binary   Scan error flag                                    Feature</w:t>
+        <w:br/>
+        <w:t>short_service_time           binary   Planned service time &lt; 25 seconds                     Feature</w:t>
+        <w:br/>
+        <w:t>delivery_failed     binary   Delivery attempt failed (DELIVERY_ATTEMPTED)                Feature</w:t>
+        <w:br/>
+        <w:t>weather_risk           categ.   low / medium / high                                Feature</w:t>
+        <w:br/>
+        <w:t>cr_number_missing      binary   Missing customer reference number                  Feature</w:t>
+        <w:br/>
+        <w:t>days_in_fc             int64    Days in fulfillment center (0–12)                  Feature</w:t>
+        <w:br/>
+        <w:t>delivery_failed        binary   TARGET: 1=failed, 0=delivered                      Target</w:t>
       </w:r>
       <w:r>
         <w:rPr>
           <w:rFonts w:ascii="Courier New" w:hAnsi="Courier New"/>
           <w:sz w:val="18"/>
         </w:rPr>
-        <w:br/>
-        <w:t>──────────────────────────────────────────────────────────────────────────────────────────</w:t>
       </w:r>
       <w:r>
         <w:rPr>
           <w:rFonts w:ascii="Courier New" w:hAnsi="Courier New"/>
           <w:sz w:val="18"/>
         </w:rPr>
-        <w:br/>
-        <w:t>package_id             string   Unique identifier (PKG-ES-XXXXXXX)                 ID only</w:t>
       </w:r>
       <w:r>
         <w:rPr>
           <w:rFonts w:ascii="Courier New" w:hAnsi="Courier New"/>
           <w:sz w:val="18"/>
         </w:rPr>
-        <w:br/>
-        <w:t>package_type           categ.   standard / high_value / fragile / locker / large   Feature</w:t>
       </w:r>
       <w:r>
         <w:rPr>
           <w:rFonts w:ascii="Courier New" w:hAnsi="Courier New"/>
           <w:sz w:val="18"/>
         </w:rPr>
-        <w:br/>
-        <w:t>shift                  categ.   morning / afternoon / night                        Feature</w:t>
       </w:r>
       <w:r>
         <w:rPr>
           <w:rFonts w:ascii="Courier New" w:hAnsi="Courier New"/>
           <w:sz w:val="18"/>
         </w:rPr>
-        <w:br/>
-        <w:t>carrier                categ.   carrier_A=Amazon, B=SEUR, C=DHL, D=Correos         Feature</w:t>
       </w:r>
       <w:r>
         <w:rPr>
           <w:rFonts w:ascii="Courier New" w:hAnsi="Courier New"/>
           <w:sz w:val="18"/>
         </w:rPr>
-        <w:br/>
-        <w:t>route_distance_km      float64  Route distance (2–85 km)                           Feature</w:t>
       </w:r>
       <w:r>
         <w:rPr>
           <w:rFonts w:ascii="Courier New" w:hAnsi="Courier New"/>
           <w:sz w:val="18"/>
         </w:rPr>
-        <w:br/>
-        <w:t>packages_in_route      int64    Total packages in driver route (15–120)            Feature</w:t>
       </w:r>
       <w:r>
         <w:rPr>
           <w:rFonts w:ascii="Courier New" w:hAnsi="Courier New"/>
           <w:sz w:val="18"/>
         </w:rPr>
-        <w:br/>
-        <w:t>double_scan            binary   Scan error flag                                    Feature</w:t>
       </w:r>
       <w:r>
         <w:rPr>
           <w:rFonts w:ascii="Courier New" w:hAnsi="Courier New"/>
           <w:sz w:val="18"/>
         </w:rPr>
-        <w:br/>
-        <w:t>locker_issue           binary   Locker unavailable at dispatch                     Feature</w:t>
       </w:r>
       <w:r>
         <w:rPr>
           <w:rFonts w:ascii="Courier New" w:hAnsi="Courier New"/>
           <w:sz w:val="18"/>
         </w:rPr>
-        <w:br/>
-        <w:t>damaged_on_arrival     binary   Package damaged when received at FC                Feature</w:t>
       </w:r>
       <w:r>
         <w:rPr>
           <w:rFonts w:ascii="Courier New" w:hAnsi="Courier New"/>
           <w:sz w:val="18"/>
         </w:rPr>
-        <w:br/>
-        <w:t>weather_risk           categ.   low / medium / high                                Feature</w:t>
       </w:r>
       <w:r>
         <w:rPr>
           <w:rFonts w:ascii="Courier New" w:hAnsi="Courier New"/>
           <w:sz w:val="18"/>
         </w:rPr>
-        <w:br/>
-        <w:t>cr_number_missing      binary   Missing customer reference number                  Feature</w:t>
       </w:r>
       <w:r>
         <w:rPr>
           <w:rFonts w:ascii="Courier New" w:hAnsi="Courier New"/>
           <w:sz w:val="18"/>
         </w:rPr>
-        <w:br/>
-        <w:t>days_in_fc             int64    Days in fulfillment center (0–12)                  Feature</w:t>
       </w:r>
       <w:r>
         <w:rPr>
           <w:rFonts w:ascii="Courier New" w:hAnsi="Courier New"/>
           <w:sz w:val="18"/>
         </w:rPr>
-        <w:br/>
-        <w:t>delivery_failed        binary   TARGET: 1=failed, 0=delivered                      Target</w:t>
       </w:r>
     </w:p>
     <w:p>

</xml_diff>